<commit_message>
docs(entrevistas): fichas y presentación de la fase 1 con los códigos E01 a E10
Co-Authored-By: Claude Opus 5.5 <noreply@anthropic.com>
</commit_message>
<xml_diff>
--- a/docs/entrevistas/Entrevista E06.docx
+++ b/docs/entrevistas/Entrevista E06.docx
@@ -13,7 +13,7 @@
           <w:sz w:val="30"/>
           <w:szCs w:val="30"/>
         </w:rPr>
-        <w:t xml:space="preserve">N.71</w:t>
+        <w:t xml:space="preserve">E06</w:t>
       </w:r>
     </w:p>
     <w:p>
@@ -1649,7 +1649,7 @@
           <w:sz w:val="21"/>
           <w:szCs w:val="21"/>
         </w:rPr>
-        <w:t xml:space="preserve">→ Lleva contabilidad defensiva. Distinto de C.57, que no lleva ninguna. Dos maneras opuestas de manejar la misma fricción de H5.</w:t>
+        <w:t xml:space="preserve">→ Lleva contabilidad defensiva. Distinto de E10, que no lleva ninguna. Dos maneras opuestas de manejar la misma fricción de H5.</w:t>
       </w:r>
     </w:p>
     <w:p>

</xml_diff>